<commit_message>
Rename ELM's cohort label: cohort-1 becomes elm
Done today because today is the only day it can be done: the post-deploy
check confirmed the database holds no rows in any cohort, and a label change
after collection begins splits one cohort into two datasets with nothing to
join them.

All three labels now match the FinPlay cohort subdomains: elm, nupco1,
nupco2. One name means one group across both platforms, the run sheets and
the checklists. Updated: the four-day checklist (rebuilt), the appendix's
environment table, the post-deploy check's default target, and the live
services record.

The Render side is a dashboard change on the original service: COHORT from
cohort-1 to elm, save, redeploy, then read the admin header.

Co-Authored-By: Claude Fable 5 <noreply@anthropic.com>
Claude-Session: https://claude.ai/code/session_015mRjSz843XwzQce7dCWaBN
</commit_message>
<xml_diff>
--- a/docs/Pre_course_checklist_4day.docx
+++ b/docs/Pre_course_checklist_4day.docx
@@ -83,7 +83,7 @@
           <w:sz w:val="19"/>
           <w:szCs w:val="19"/>
         </w:rPr>
-        <w:t xml:space="preserve">the four-day service, `PROGRAMME_DAYS=4`, cohort label `cohort-1`</w:t>
+        <w:t xml:space="preserve">the four-day service, `PROGRAMME_DAYS=4`, cohort label `elm`</w:t>
       </w:r>
     </w:p>
     <w:p>
@@ -1265,7 +1265,7 @@
           <w:sz w:val="21"/>
           <w:szCs w:val="21"/>
         </w:rPr>
-        <w:t xml:space="preserve">: counts all zero, header reads "instruments open", cohort `cohort-1`, </w:t>
+        <w:t xml:space="preserve">: counts all zero, header reads "instruments open", cohort `elm`, </w:t>
       </w:r>
       <w:r>
         <w:rPr>

</xml_diff>